<commit_message>
Use the Forvis Mazars Sebit (Korea) name and the forvismazars.com domain
The instructions named the firm two different ways and carried a .kr email
domain. Use the legal name everywhere and correct both addresses, including
the one that had a stray space after the @.

Drop the last two Mazars-internal passages from the independence section
while doing so: the CCOI is a code PwC India cannot apply, and the paragraph
on how the audit manual is amended by the Country Risk Manager has no
application to them. The substantive rule that stricter local requirements
apply is kept.

Co-Authored-By: Claude Opus 5 <noreply@anthropic.com>
Claude-Session: https://claude.ai/code/session_01T1xmsUUWDmBZ69n2rRaRui
</commit_message>
<xml_diff>
--- a/Faurecia_Korea_2026_GAI_Appendix_A_Component_Auditors_Confirmations_IN04.docx
+++ b/Faurecia_Korea_2026_GAI_Appendix_A_Component_Auditors_Confirmations_IN04.docx
@@ -158,7 +158,20 @@
                 <w:sz w:val="24"/>
                 <w:highlight w:val="yellow"/>
               </w:rPr>
-              <w:t xml:space="preserve">Mazars Sebit (Korea) – Seoul, Korea</w:t>
+              <w:t xml:space="preserve"/>
+            </w:r>
+            <w:r>
+              <w:rPr>
+                <w:sz w:val="24"/>
+                <w:highlight w:val="yellow"/>
+              </w:rPr>
+              <w:t xml:space="preserve">Forvis Mazars Sebit (Korea)</w:t>
+            </w:r>
+            <w:r>
+              <w:rPr>
+                <w:sz w:val="24"/>
+              </w:rPr>
+              <w:t xml:space="preserve"> – Seoul, Korea</w:t>
             </w:r>
             <w:r>
               <w:rPr>
@@ -4405,6 +4418,9 @@
       <w:headerReference w:type="default" r:id="rId8"/>
       <w:footerReference w:type="even" r:id="rId9"/>
       <w:footerReference w:type="default" r:id="rId10"/>
+      <w:headerReference w:type="first" r:id="rId13"/>
+      <w:footerReference w:type="first" r:id="rId14"/>
+      <w:headerReference w:type="even" r:id="rId15"/>
       <w:pgSz w:w="11906" w:h="16838"/>
       <w:pgMar w:top="1276" w:right="1134" w:bottom="1418" w:left="1134" w:header="709" w:footer="709" w:gutter="0"/>
       <w:cols w:space="708"/>
@@ -4555,6 +4571,16 @@
     <w:pPr>
       <w:pStyle w:val="a9"/>
       <w:ind w:right="360"/>
+    </w:pPr>
+  </w:p>
+</w:ftr>
+</file>
+
+<file path=word/footer3.xml><?xml version="1.0" encoding="utf-8"?>
+<w:ftr xmlns:m="http://schemas.openxmlformats.org/officeDocument/2006/math" xmlns:mc="http://schemas.openxmlformats.org/markup-compatibility/2006" xmlns:mo="http://schemas.microsoft.com/office/mac/office/2008/main" xmlns:mv="urn:schemas-microsoft-com:mac:vml" xmlns:o="urn:schemas-microsoft-com:office:office" xmlns:r="http://schemas.openxmlformats.org/officeDocument/2006/relationships" xmlns:v="urn:schemas-microsoft-com:vml" xmlns:w10="urn:schemas-microsoft-com:office:word" xmlns:w14="http://schemas.microsoft.com/office/word/2010/wordml" xmlns:w="http://schemas.openxmlformats.org/wordprocessingml/2006/main" xmlns:wne="http://schemas.microsoft.com/office/word/2006/wordml" xmlns:wp14="http://schemas.microsoft.com/office/word/2010/wordprocessingDrawing" xmlns:wp="http://schemas.openxmlformats.org/drawingml/2006/wordprocessingDrawing" xmlns:wpc="http://schemas.microsoft.com/office/word/2010/wordprocessingCanvas" xmlns:wpg="http://schemas.microsoft.com/office/word/2010/wordprocessingGroup" xmlns:wpi="http://schemas.microsoft.com/office/word/2010/wordprocessingInk" xmlns:wps="http://schemas.microsoft.com/office/word/2010/wordprocessingShape" mc:Ignorable="w14 wp14">
+  <w:p>
+    <w:pPr>
+      <w:pStyle w:val="Footer"/>
     </w:pPr>
   </w:p>
 </w:ftr>
@@ -4751,6 +4777,26 @@
         <w:rFonts w:ascii="Times New Roman" w:hAnsi="Times New Roman"/>
         <w:sz w:val="24"/>
       </w:rPr>
+    </w:pPr>
+  </w:p>
+</w:hdr>
+</file>
+
+<file path=word/header2.xml><?xml version="1.0" encoding="utf-8"?>
+<w:hdr xmlns:m="http://schemas.openxmlformats.org/officeDocument/2006/math" xmlns:mc="http://schemas.openxmlformats.org/markup-compatibility/2006" xmlns:mo="http://schemas.microsoft.com/office/mac/office/2008/main" xmlns:mv="urn:schemas-microsoft-com:mac:vml" xmlns:o="urn:schemas-microsoft-com:office:office" xmlns:r="http://schemas.openxmlformats.org/officeDocument/2006/relationships" xmlns:v="urn:schemas-microsoft-com:vml" xmlns:w10="urn:schemas-microsoft-com:office:word" xmlns:w14="http://schemas.microsoft.com/office/word/2010/wordml" xmlns:w="http://schemas.openxmlformats.org/wordprocessingml/2006/main" xmlns:wne="http://schemas.microsoft.com/office/word/2006/wordml" xmlns:wp14="http://schemas.microsoft.com/office/word/2010/wordprocessingDrawing" xmlns:wp="http://schemas.openxmlformats.org/drawingml/2006/wordprocessingDrawing" xmlns:wpc="http://schemas.microsoft.com/office/word/2010/wordprocessingCanvas" xmlns:wpg="http://schemas.microsoft.com/office/word/2010/wordprocessingGroup" xmlns:wpi="http://schemas.microsoft.com/office/word/2010/wordprocessingInk" xmlns:wps="http://schemas.microsoft.com/office/word/2010/wordprocessingShape" mc:Ignorable="w14 wp14">
+  <w:p>
+    <w:pPr>
+      <w:pStyle w:val="Header"/>
+    </w:pPr>
+  </w:p>
+</w:hdr>
+</file>
+
+<file path=word/header3.xml><?xml version="1.0" encoding="utf-8"?>
+<w:hdr xmlns:m="http://schemas.openxmlformats.org/officeDocument/2006/math" xmlns:mc="http://schemas.openxmlformats.org/markup-compatibility/2006" xmlns:mo="http://schemas.microsoft.com/office/mac/office/2008/main" xmlns:mv="urn:schemas-microsoft-com:mac:vml" xmlns:o="urn:schemas-microsoft-com:office:office" xmlns:r="http://schemas.openxmlformats.org/officeDocument/2006/relationships" xmlns:v="urn:schemas-microsoft-com:vml" xmlns:w10="urn:schemas-microsoft-com:office:word" xmlns:w14="http://schemas.microsoft.com/office/word/2010/wordml" xmlns:w="http://schemas.openxmlformats.org/wordprocessingml/2006/main" xmlns:wne="http://schemas.microsoft.com/office/word/2006/wordml" xmlns:wp14="http://schemas.microsoft.com/office/word/2010/wordprocessingDrawing" xmlns:wp="http://schemas.openxmlformats.org/drawingml/2006/wordprocessingDrawing" xmlns:wpc="http://schemas.microsoft.com/office/word/2010/wordprocessingCanvas" xmlns:wpg="http://schemas.microsoft.com/office/word/2010/wordprocessingGroup" xmlns:wpi="http://schemas.microsoft.com/office/word/2010/wordprocessingInk" xmlns:wps="http://schemas.microsoft.com/office/word/2010/wordprocessingShape" mc:Ignorable="w14 wp14">
+  <w:p>
+    <w:pPr>
+      <w:pStyle w:val="Header"/>
     </w:pPr>
   </w:p>
 </w:hdr>

</xml_diff>

<commit_message>
Drop the component materiality disclaimer and the two unusable appendices
Saying we do not communicate a component materiality is not something ISA 600
(Revised) asks for. Remove the statement from D.2 and from Appendix A and
keep only the pointer to where the amounts we do communicate are, since the
paragraph that follows the CM bullet already asks for the component auditor's
own statutory materiality. Align the review scope bullet, the last place
still referring to a component materiality we assign.

Drop D3 and D5a. Neither applies to a full scope component, and the timetable
gave both a reporting deadline, which implied deliverables that are not due.
Remove their rows from the timetable and the appendix table and leave them
out of the pack rather than shipping templates with a do-not-use banner.

Co-Authored-By: Claude Opus 5 <noreply@anthropic.com>
Claude-Session: https://claude.ai/code/session_01T1xmsUUWDmBZ69n2rRaRui
</commit_message>
<xml_diff>
--- a/Faurecia_Korea_2026_GAI_Appendix_A_Component_Auditors_Confirmations_IN04.docx
+++ b/Faurecia_Korea_2026_GAI_Appendix_A_Component_Auditors_Confirmations_IN04.docx
@@ -3590,23 +3590,6 @@
       <w:r>
         <w:rPr>
           <w:sz w:val="24"/>
-          <w:highlight w:val="yellow"/>
-        </w:rPr>
-        <w:t xml:space="preserve">Under ISA 600 (Revised) the Group engagement team determines and communicates a Component performance materiality and a threshold for clearly trivial misstatements, rather than a separate component materiality. The amounts applicable to your work are disclosed in section D.3 of the Group Audit Instructions (Component performance materiality: KRW 2,838,000,000; threshold for clearly trivial misstatements: KRW 269,000,000) and must be used in the work on the reporting package requested.</w:t>
-      </w:r>
-    </w:p>
-    <w:p>
-      <w:pPr>
-        <w:pStyle w:val="KNormal"/>
-        <w:shd w:val="clear" w:color="auto" w:fill="FFFFFF"/>
-        <w:spacing w:after="120"/>
-        <w:rPr>
-          <w:sz w:val="24"/>
-        </w:rPr>
-      </w:pPr>
-      <w:r>
-        <w:rPr>
-          <w:sz w:val="24"/>
         </w:rPr>
         <w:t xml:space="preserve">For </w:t>
       </w:r>
@@ -3783,7 +3766,14 @@
           <w:sz w:val="24"/>
           <w:highlight w:val="yellow"/>
         </w:rPr>
-        <w:t xml:space="preserve">We have determined a Component performance materiality which is disclosed in section D.3 of the Group Audit Instructions</w:t>
+        <w:t xml:space="preserve">We have determined a Component performance materiality which is </w:t>
+      </w:r>
+      <w:r>
+        <w:rPr>
+          <w:sz w:val="24"/>
+          <w:highlight w:val="yellow"/>
+        </w:rPr>
+        <w:t xml:space="preserve">disclosed in section D.3 of the Group Audit Instructions (KRW 2,838,000,000)</w:t>
       </w:r>
       <w:r>
         <w:rPr>

</xml_diff>